<commit_message>
fix: resolve table border issues in docx export and web preview
</commit_message>
<xml_diff>
--- a/khbd-renderer/KHBD_output.docx
+++ b/khbd-renderer/KHBD_output.docx
@@ -339,10 +339,10 @@
       <w:tblPr>
         <w:tblW w:type="dxa" w:w="9356"/>
         <w:tblBorders>
-          <w:top w:val="single" w:color="auto" w:sz="4"/>
-          <w:left w:val="single" w:color="auto" w:sz="4"/>
-          <w:bottom w:val="single" w:color="auto" w:sz="4"/>
-          <w:right w:val="single" w:color="auto" w:sz="4"/>
+          <w:top w:val="single" w:color="000000" w:sz="6"/>
+          <w:left w:val="single" w:color="000000" w:sz="6"/>
+          <w:bottom w:val="single" w:color="000000" w:sz="6"/>
+          <w:right w:val="single" w:color="000000" w:sz="6"/>
           <w:insideH w:val="single" w:color="auto" w:sz="4"/>
           <w:insideV w:val="single" w:color="auto" w:sz="4"/>
         </w:tblBorders>
@@ -432,13 +432,13 @@
             <w:tcBorders>
               <w:top w:val="single" w:color="000000" w:sz="6"/>
               <w:left w:val="single" w:color="000000" w:sz="6"/>
-              <w:bottom w:val="none" w:color="FFFFFF" w:sz="0"/>
+              <w:bottom w:val="single" w:color="000000" w:sz="6"/>
               <w:right w:val="single" w:color="000000" w:sz="6"/>
             </w:tcBorders>
             <w:tcMar>
               <w:top w:type="dxa" w:w="60"/>
               <w:left w:type="dxa" w:w="100"/>
-              <w:bottom w:type="dxa" w:w="20"/>
+              <w:bottom w:type="dxa" w:w="60"/>
               <w:right w:type="dxa" w:w="100"/>
             </w:tcMar>
           </w:tcPr>
@@ -467,9 +467,9 @@
           <w:tcPr>
             <w:tcW w:type="dxa" w:w="4678"/>
             <w:tcBorders>
-              <w:top w:val="none" w:color="FFFFFF" w:sz="0"/>
-              <w:left w:val="single" w:color="000000" w:sz="6"/>
-              <w:bottom w:val="none" w:color="FFFFFF" w:sz="0"/>
+              <w:top w:val="single" w:color="000000" w:sz="6"/>
+              <w:left w:val="single" w:color="000000" w:sz="6"/>
+              <w:bottom w:val="single" w:color="000000" w:sz="6"/>
               <w:right w:val="single" w:color="000000" w:sz="6"/>
             </w:tcBorders>
             <w:tcMar>
@@ -503,9 +503,9 @@
           <w:tcPr>
             <w:tcW w:type="dxa" w:w="4678"/>
             <w:tcBorders>
-              <w:top w:val="none" w:color="FFFFFF" w:sz="0"/>
-              <w:left w:val="single" w:color="000000" w:sz="6"/>
-              <w:bottom w:val="none" w:color="FFFFFF" w:sz="0"/>
+              <w:top w:val="single" w:color="000000" w:sz="6"/>
+              <w:left w:val="single" w:color="000000" w:sz="6"/>
+              <w:bottom w:val="single" w:color="000000" w:sz="6"/>
               <w:right w:val="single" w:color="000000" w:sz="6"/>
             </w:tcBorders>
             <w:tcMar>
@@ -544,9 +544,9 @@
           <w:tcPr>
             <w:tcW w:type="dxa" w:w="4678"/>
             <w:tcBorders>
-              <w:top w:val="none" w:color="FFFFFF" w:sz="0"/>
-              <w:left w:val="single" w:color="000000" w:sz="6"/>
-              <w:bottom w:val="none" w:color="FFFFFF" w:sz="0"/>
+              <w:top w:val="single" w:color="000000" w:sz="6"/>
+              <w:left w:val="single" w:color="000000" w:sz="6"/>
+              <w:bottom w:val="single" w:color="000000" w:sz="6"/>
               <w:right w:val="single" w:color="000000" w:sz="6"/>
             </w:tcBorders>
             <w:tcMar>
@@ -580,9 +580,9 @@
           <w:tcPr>
             <w:tcW w:type="dxa" w:w="4678"/>
             <w:tcBorders>
-              <w:top w:val="none" w:color="FFFFFF" w:sz="0"/>
-              <w:left w:val="single" w:color="000000" w:sz="6"/>
-              <w:bottom w:val="none" w:color="FFFFFF" w:sz="0"/>
+              <w:top w:val="single" w:color="000000" w:sz="6"/>
+              <w:left w:val="single" w:color="000000" w:sz="6"/>
+              <w:bottom w:val="single" w:color="000000" w:sz="6"/>
               <w:right w:val="single" w:color="000000" w:sz="6"/>
             </w:tcBorders>
             <w:tcMar>
@@ -621,9 +621,9 @@
           <w:tcPr>
             <w:tcW w:type="dxa" w:w="4678"/>
             <w:tcBorders>
-              <w:top w:val="none" w:color="FFFFFF" w:sz="0"/>
-              <w:left w:val="single" w:color="000000" w:sz="6"/>
-              <w:bottom w:val="none" w:color="FFFFFF" w:sz="0"/>
+              <w:top w:val="single" w:color="000000" w:sz="6"/>
+              <w:left w:val="single" w:color="000000" w:sz="6"/>
+              <w:bottom w:val="single" w:color="000000" w:sz="6"/>
               <w:right w:val="single" w:color="000000" w:sz="6"/>
             </w:tcBorders>
             <w:tcMar>
@@ -657,9 +657,9 @@
           <w:tcPr>
             <w:tcW w:type="dxa" w:w="4678"/>
             <w:tcBorders>
-              <w:top w:val="none" w:color="FFFFFF" w:sz="0"/>
-              <w:left w:val="single" w:color="000000" w:sz="6"/>
-              <w:bottom w:val="none" w:color="FFFFFF" w:sz="0"/>
+              <w:top w:val="single" w:color="000000" w:sz="6"/>
+              <w:left w:val="single" w:color="000000" w:sz="6"/>
+              <w:bottom w:val="single" w:color="000000" w:sz="6"/>
               <w:right w:val="single" w:color="000000" w:sz="6"/>
             </w:tcBorders>
             <w:tcMar>
@@ -698,9 +698,9 @@
           <w:tcPr>
             <w:tcW w:type="dxa" w:w="4678"/>
             <w:tcBorders>
-              <w:top w:val="none" w:color="FFFFFF" w:sz="0"/>
-              <w:left w:val="single" w:color="000000" w:sz="6"/>
-              <w:bottom w:val="none" w:color="FFFFFF" w:sz="0"/>
+              <w:top w:val="single" w:color="000000" w:sz="6"/>
+              <w:left w:val="single" w:color="000000" w:sz="6"/>
+              <w:bottom w:val="single" w:color="000000" w:sz="6"/>
               <w:right w:val="single" w:color="000000" w:sz="6"/>
             </w:tcBorders>
             <w:tcMar>
@@ -734,9 +734,9 @@
           <w:tcPr>
             <w:tcW w:type="dxa" w:w="4678"/>
             <w:tcBorders>
-              <w:top w:val="none" w:color="FFFFFF" w:sz="0"/>
-              <w:left w:val="single" w:color="000000" w:sz="6"/>
-              <w:bottom w:val="none" w:color="FFFFFF" w:sz="0"/>
+              <w:top w:val="single" w:color="000000" w:sz="6"/>
+              <w:left w:val="single" w:color="000000" w:sz="6"/>
+              <w:bottom w:val="single" w:color="000000" w:sz="6"/>
               <w:right w:val="single" w:color="000000" w:sz="6"/>
             </w:tcBorders>
             <w:tcMar>
@@ -778,13 +778,13 @@
             <w:tcBorders>
               <w:top w:val="single" w:color="000000" w:sz="6"/>
               <w:left w:val="single" w:color="000000" w:sz="6"/>
-              <w:bottom w:val="none" w:color="FFFFFF" w:sz="0"/>
+              <w:bottom w:val="single" w:color="000000" w:sz="6"/>
               <w:right w:val="single" w:color="000000" w:sz="6"/>
             </w:tcBorders>
             <w:tcMar>
               <w:top w:type="dxa" w:w="60"/>
               <w:left w:type="dxa" w:w="100"/>
-              <w:bottom w:type="dxa" w:w="20"/>
+              <w:bottom w:type="dxa" w:w="60"/>
               <w:right w:type="dxa" w:w="100"/>
             </w:tcMar>
           </w:tcPr>
@@ -813,9 +813,9 @@
           <w:tcPr>
             <w:tcW w:type="dxa" w:w="4678"/>
             <w:tcBorders>
-              <w:top w:val="none" w:color="FFFFFF" w:sz="0"/>
-              <w:left w:val="single" w:color="000000" w:sz="6"/>
-              <w:bottom w:val="none" w:color="FFFFFF" w:sz="0"/>
+              <w:top w:val="single" w:color="000000" w:sz="6"/>
+              <w:left w:val="single" w:color="000000" w:sz="6"/>
+              <w:bottom w:val="single" w:color="000000" w:sz="6"/>
               <w:right w:val="single" w:color="000000" w:sz="6"/>
             </w:tcBorders>
             <w:tcMar>
@@ -849,9 +849,9 @@
           <w:tcPr>
             <w:tcW w:type="dxa" w:w="4678"/>
             <w:tcBorders>
-              <w:top w:val="none" w:color="FFFFFF" w:sz="0"/>
-              <w:left w:val="single" w:color="000000" w:sz="6"/>
-              <w:bottom w:val="none" w:color="FFFFFF" w:sz="0"/>
+              <w:top w:val="single" w:color="000000" w:sz="6"/>
+              <w:left w:val="single" w:color="000000" w:sz="6"/>
+              <w:bottom w:val="single" w:color="000000" w:sz="6"/>
               <w:right w:val="single" w:color="000000" w:sz="6"/>
             </w:tcBorders>
             <w:tcMar>
@@ -890,9 +890,9 @@
           <w:tcPr>
             <w:tcW w:type="dxa" w:w="4678"/>
             <w:tcBorders>
-              <w:top w:val="none" w:color="FFFFFF" w:sz="0"/>
-              <w:left w:val="single" w:color="000000" w:sz="6"/>
-              <w:bottom w:val="none" w:color="FFFFFF" w:sz="0"/>
+              <w:top w:val="single" w:color="000000" w:sz="6"/>
+              <w:left w:val="single" w:color="000000" w:sz="6"/>
+              <w:bottom w:val="single" w:color="000000" w:sz="6"/>
               <w:right w:val="single" w:color="000000" w:sz="6"/>
             </w:tcBorders>
             <w:tcMar>
@@ -926,9 +926,9 @@
           <w:tcPr>
             <w:tcW w:type="dxa" w:w="4678"/>
             <w:tcBorders>
-              <w:top w:val="none" w:color="FFFFFF" w:sz="0"/>
-              <w:left w:val="single" w:color="000000" w:sz="6"/>
-              <w:bottom w:val="none" w:color="FFFFFF" w:sz="0"/>
+              <w:top w:val="single" w:color="000000" w:sz="6"/>
+              <w:left w:val="single" w:color="000000" w:sz="6"/>
+              <w:bottom w:val="single" w:color="000000" w:sz="6"/>
               <w:right w:val="single" w:color="000000" w:sz="6"/>
             </w:tcBorders>
             <w:tcMar>
@@ -967,9 +967,9 @@
           <w:tcPr>
             <w:tcW w:type="dxa" w:w="4678"/>
             <w:tcBorders>
-              <w:top w:val="none" w:color="FFFFFF" w:sz="0"/>
-              <w:left w:val="single" w:color="000000" w:sz="6"/>
-              <w:bottom w:val="none" w:color="FFFFFF" w:sz="0"/>
+              <w:top w:val="single" w:color="000000" w:sz="6"/>
+              <w:left w:val="single" w:color="000000" w:sz="6"/>
+              <w:bottom w:val="single" w:color="000000" w:sz="6"/>
               <w:right w:val="single" w:color="000000" w:sz="6"/>
             </w:tcBorders>
             <w:tcMar>
@@ -1003,9 +1003,9 @@
           <w:tcPr>
             <w:tcW w:type="dxa" w:w="4678"/>
             <w:tcBorders>
-              <w:top w:val="none" w:color="FFFFFF" w:sz="0"/>
-              <w:left w:val="single" w:color="000000" w:sz="6"/>
-              <w:bottom w:val="none" w:color="FFFFFF" w:sz="0"/>
+              <w:top w:val="single" w:color="000000" w:sz="6"/>
+              <w:left w:val="single" w:color="000000" w:sz="6"/>
+              <w:bottom w:val="single" w:color="000000" w:sz="6"/>
               <w:right w:val="single" w:color="000000" w:sz="6"/>
             </w:tcBorders>
             <w:tcMar>
@@ -1044,9 +1044,9 @@
           <w:tcPr>
             <w:tcW w:type="dxa" w:w="4678"/>
             <w:tcBorders>
-              <w:top w:val="none" w:color="FFFFFF" w:sz="0"/>
-              <w:left w:val="single" w:color="000000" w:sz="6"/>
-              <w:bottom w:val="none" w:color="FFFFFF" w:sz="0"/>
+              <w:top w:val="single" w:color="000000" w:sz="6"/>
+              <w:left w:val="single" w:color="000000" w:sz="6"/>
+              <w:bottom w:val="single" w:color="000000" w:sz="6"/>
               <w:right w:val="single" w:color="000000" w:sz="6"/>
             </w:tcBorders>
             <w:tcMar>
@@ -1080,9 +1080,9 @@
           <w:tcPr>
             <w:tcW w:type="dxa" w:w="4678"/>
             <w:tcBorders>
-              <w:top w:val="none" w:color="FFFFFF" w:sz="0"/>
-              <w:left w:val="single" w:color="000000" w:sz="6"/>
-              <w:bottom w:val="none" w:color="FFFFFF" w:sz="0"/>
+              <w:top w:val="single" w:color="000000" w:sz="6"/>
+              <w:left w:val="single" w:color="000000" w:sz="6"/>
+              <w:bottom w:val="single" w:color="000000" w:sz="6"/>
               <w:right w:val="single" w:color="000000" w:sz="6"/>
             </w:tcBorders>
             <w:tcMar>
@@ -1121,9 +1121,9 @@
           <w:tcPr>
             <w:tcW w:type="dxa" w:w="4678"/>
             <w:tcBorders>
-              <w:top w:val="none" w:color="FFFFFF" w:sz="0"/>
-              <w:left w:val="single" w:color="000000" w:sz="6"/>
-              <w:bottom w:val="none" w:color="FFFFFF" w:sz="0"/>
+              <w:top w:val="single" w:color="000000" w:sz="6"/>
+              <w:left w:val="single" w:color="000000" w:sz="6"/>
+              <w:bottom w:val="single" w:color="000000" w:sz="6"/>
               <w:right w:val="single" w:color="000000" w:sz="6"/>
             </w:tcBorders>
             <w:tcMar>
@@ -1157,9 +1157,9 @@
           <w:tcPr>
             <w:tcW w:type="dxa" w:w="4678"/>
             <w:tcBorders>
-              <w:top w:val="none" w:color="FFFFFF" w:sz="0"/>
-              <w:left w:val="single" w:color="000000" w:sz="6"/>
-              <w:bottom w:val="none" w:color="FFFFFF" w:sz="0"/>
+              <w:top w:val="single" w:color="000000" w:sz="6"/>
+              <w:left w:val="single" w:color="000000" w:sz="6"/>
+              <w:bottom w:val="single" w:color="000000" w:sz="6"/>
               <w:right w:val="single" w:color="000000" w:sz="6"/>
             </w:tcBorders>
             <w:tcMar>
@@ -1198,9 +1198,9 @@
           <w:tcPr>
             <w:tcW w:type="dxa" w:w="4678"/>
             <w:tcBorders>
-              <w:top w:val="none" w:color="FFFFFF" w:sz="0"/>
-              <w:left w:val="single" w:color="000000" w:sz="6"/>
-              <w:bottom w:val="none" w:color="FFFFFF" w:sz="0"/>
+              <w:top w:val="single" w:color="000000" w:sz="6"/>
+              <w:left w:val="single" w:color="000000" w:sz="6"/>
+              <w:bottom w:val="single" w:color="000000" w:sz="6"/>
               <w:right w:val="single" w:color="000000" w:sz="6"/>
             </w:tcBorders>
             <w:tcMar>
@@ -1234,9 +1234,9 @@
           <w:tcPr>
             <w:tcW w:type="dxa" w:w="4678"/>
             <w:tcBorders>
-              <w:top w:val="none" w:color="FFFFFF" w:sz="0"/>
-              <w:left w:val="single" w:color="000000" w:sz="6"/>
-              <w:bottom w:val="none" w:color="FFFFFF" w:sz="0"/>
+              <w:top w:val="single" w:color="000000" w:sz="6"/>
+              <w:left w:val="single" w:color="000000" w:sz="6"/>
+              <w:bottom w:val="single" w:color="000000" w:sz="6"/>
               <w:right w:val="single" w:color="000000" w:sz="6"/>
             </w:tcBorders>
             <w:tcMar>
@@ -1275,9 +1275,9 @@
           <w:tcPr>
             <w:tcW w:type="dxa" w:w="4678"/>
             <w:tcBorders>
-              <w:top w:val="none" w:color="FFFFFF" w:sz="0"/>
-              <w:left w:val="single" w:color="000000" w:sz="6"/>
-              <w:bottom w:val="none" w:color="FFFFFF" w:sz="0"/>
+              <w:top w:val="single" w:color="000000" w:sz="6"/>
+              <w:left w:val="single" w:color="000000" w:sz="6"/>
+              <w:bottom w:val="single" w:color="000000" w:sz="6"/>
               <w:right w:val="single" w:color="000000" w:sz="6"/>
             </w:tcBorders>
             <w:tcMar>
@@ -1311,9 +1311,9 @@
           <w:tcPr>
             <w:tcW w:type="dxa" w:w="4678"/>
             <w:tcBorders>
-              <w:top w:val="none" w:color="FFFFFF" w:sz="0"/>
-              <w:left w:val="single" w:color="000000" w:sz="6"/>
-              <w:bottom w:val="none" w:color="FFFFFF" w:sz="0"/>
+              <w:top w:val="single" w:color="000000" w:sz="6"/>
+              <w:left w:val="single" w:color="000000" w:sz="6"/>
+              <w:bottom w:val="single" w:color="000000" w:sz="6"/>
               <w:right w:val="single" w:color="000000" w:sz="6"/>
             </w:tcBorders>
             <w:tcMar>
@@ -1352,9 +1352,9 @@
           <w:tcPr>
             <w:tcW w:type="dxa" w:w="4678"/>
             <w:tcBorders>
-              <w:top w:val="none" w:color="FFFFFF" w:sz="0"/>
-              <w:left w:val="single" w:color="000000" w:sz="6"/>
-              <w:bottom w:val="none" w:color="FFFFFF" w:sz="0"/>
+              <w:top w:val="single" w:color="000000" w:sz="6"/>
+              <w:left w:val="single" w:color="000000" w:sz="6"/>
+              <w:bottom w:val="single" w:color="000000" w:sz="6"/>
               <w:right w:val="single" w:color="000000" w:sz="6"/>
             </w:tcBorders>
             <w:tcMar>
@@ -1388,9 +1388,9 @@
           <w:tcPr>
             <w:tcW w:type="dxa" w:w="4678"/>
             <w:tcBorders>
-              <w:top w:val="none" w:color="FFFFFF" w:sz="0"/>
-              <w:left w:val="single" w:color="000000" w:sz="6"/>
-              <w:bottom w:val="none" w:color="FFFFFF" w:sz="0"/>
+              <w:top w:val="single" w:color="000000" w:sz="6"/>
+              <w:left w:val="single" w:color="000000" w:sz="6"/>
+              <w:bottom w:val="single" w:color="000000" w:sz="6"/>
               <w:right w:val="single" w:color="000000" w:sz="6"/>
             </w:tcBorders>
             <w:tcMar>
@@ -1432,13 +1432,13 @@
             <w:tcBorders>
               <w:top w:val="single" w:color="000000" w:sz="6"/>
               <w:left w:val="single" w:color="000000" w:sz="6"/>
-              <w:bottom w:val="none" w:color="FFFFFF" w:sz="0"/>
+              <w:bottom w:val="single" w:color="000000" w:sz="6"/>
               <w:right w:val="single" w:color="000000" w:sz="6"/>
             </w:tcBorders>
             <w:tcMar>
               <w:top w:type="dxa" w:w="60"/>
               <w:left w:type="dxa" w:w="100"/>
-              <w:bottom w:type="dxa" w:w="20"/>
+              <w:bottom w:type="dxa" w:w="60"/>
               <w:right w:type="dxa" w:w="100"/>
             </w:tcMar>
           </w:tcPr>
@@ -1467,9 +1467,9 @@
           <w:tcPr>
             <w:tcW w:type="dxa" w:w="4678"/>
             <w:tcBorders>
-              <w:top w:val="none" w:color="FFFFFF" w:sz="0"/>
-              <w:left w:val="single" w:color="000000" w:sz="6"/>
-              <w:bottom w:val="none" w:color="FFFFFF" w:sz="0"/>
+              <w:top w:val="single" w:color="000000" w:sz="6"/>
+              <w:left w:val="single" w:color="000000" w:sz="6"/>
+              <w:bottom w:val="single" w:color="000000" w:sz="6"/>
               <w:right w:val="single" w:color="000000" w:sz="6"/>
             </w:tcBorders>
             <w:tcMar>
@@ -1503,9 +1503,9 @@
           <w:tcPr>
             <w:tcW w:type="dxa" w:w="4678"/>
             <w:tcBorders>
-              <w:top w:val="none" w:color="FFFFFF" w:sz="0"/>
-              <w:left w:val="single" w:color="000000" w:sz="6"/>
-              <w:bottom w:val="none" w:color="FFFFFF" w:sz="0"/>
+              <w:top w:val="single" w:color="000000" w:sz="6"/>
+              <w:left w:val="single" w:color="000000" w:sz="6"/>
+              <w:bottom w:val="single" w:color="000000" w:sz="6"/>
               <w:right w:val="single" w:color="000000" w:sz="6"/>
             </w:tcBorders>
             <w:tcMar>
@@ -1544,9 +1544,9 @@
           <w:tcPr>
             <w:tcW w:type="dxa" w:w="4678"/>
             <w:tcBorders>
-              <w:top w:val="none" w:color="FFFFFF" w:sz="0"/>
-              <w:left w:val="single" w:color="000000" w:sz="6"/>
-              <w:bottom w:val="none" w:color="FFFFFF" w:sz="0"/>
+              <w:top w:val="single" w:color="000000" w:sz="6"/>
+              <w:left w:val="single" w:color="000000" w:sz="6"/>
+              <w:bottom w:val="single" w:color="000000" w:sz="6"/>
               <w:right w:val="single" w:color="000000" w:sz="6"/>
             </w:tcBorders>
             <w:tcMar>
@@ -1580,9 +1580,9 @@
           <w:tcPr>
             <w:tcW w:type="dxa" w:w="4678"/>
             <w:tcBorders>
-              <w:top w:val="none" w:color="FFFFFF" w:sz="0"/>
-              <w:left w:val="single" w:color="000000" w:sz="6"/>
-              <w:bottom w:val="none" w:color="FFFFFF" w:sz="0"/>
+              <w:top w:val="single" w:color="000000" w:sz="6"/>
+              <w:left w:val="single" w:color="000000" w:sz="6"/>
+              <w:bottom w:val="single" w:color="000000" w:sz="6"/>
               <w:right w:val="single" w:color="000000" w:sz="6"/>
             </w:tcBorders>
             <w:tcMar>
@@ -1621,9 +1621,9 @@
           <w:tcPr>
             <w:tcW w:type="dxa" w:w="4678"/>
             <w:tcBorders>
-              <w:top w:val="none" w:color="FFFFFF" w:sz="0"/>
-              <w:left w:val="single" w:color="000000" w:sz="6"/>
-              <w:bottom w:val="none" w:color="FFFFFF" w:sz="0"/>
+              <w:top w:val="single" w:color="000000" w:sz="6"/>
+              <w:left w:val="single" w:color="000000" w:sz="6"/>
+              <w:bottom w:val="single" w:color="000000" w:sz="6"/>
               <w:right w:val="single" w:color="000000" w:sz="6"/>
             </w:tcBorders>
             <w:tcMar>
@@ -1657,9 +1657,9 @@
           <w:tcPr>
             <w:tcW w:type="dxa" w:w="4678"/>
             <w:tcBorders>
-              <w:top w:val="none" w:color="FFFFFF" w:sz="0"/>
-              <w:left w:val="single" w:color="000000" w:sz="6"/>
-              <w:bottom w:val="none" w:color="FFFFFF" w:sz="0"/>
+              <w:top w:val="single" w:color="000000" w:sz="6"/>
+              <w:left w:val="single" w:color="000000" w:sz="6"/>
+              <w:bottom w:val="single" w:color="000000" w:sz="6"/>
               <w:right w:val="single" w:color="000000" w:sz="6"/>
             </w:tcBorders>
             <w:tcMar>
@@ -1701,13 +1701,13 @@
             <w:tcBorders>
               <w:top w:val="single" w:color="000000" w:sz="6"/>
               <w:left w:val="single" w:color="000000" w:sz="6"/>
-              <w:bottom w:val="none" w:color="FFFFFF" w:sz="0"/>
+              <w:bottom w:val="single" w:color="000000" w:sz="6"/>
               <w:right w:val="single" w:color="000000" w:sz="6"/>
             </w:tcBorders>
             <w:tcMar>
               <w:top w:type="dxa" w:w="60"/>
               <w:left w:type="dxa" w:w="100"/>
-              <w:bottom w:type="dxa" w:w="20"/>
+              <w:bottom w:type="dxa" w:w="60"/>
               <w:right w:type="dxa" w:w="100"/>
             </w:tcMar>
           </w:tcPr>
@@ -1736,9 +1736,9 @@
           <w:tcPr>
             <w:tcW w:type="dxa" w:w="4678"/>
             <w:tcBorders>
-              <w:top w:val="none" w:color="FFFFFF" w:sz="0"/>
-              <w:left w:val="single" w:color="000000" w:sz="6"/>
-              <w:bottom w:val="none" w:color="FFFFFF" w:sz="0"/>
+              <w:top w:val="single" w:color="000000" w:sz="6"/>
+              <w:left w:val="single" w:color="000000" w:sz="6"/>
+              <w:bottom w:val="single" w:color="000000" w:sz="6"/>
               <w:right w:val="single" w:color="000000" w:sz="6"/>
             </w:tcBorders>
             <w:tcMar>
@@ -1772,9 +1772,9 @@
           <w:tcPr>
             <w:tcW w:type="dxa" w:w="4678"/>
             <w:tcBorders>
-              <w:top w:val="none" w:color="FFFFFF" w:sz="0"/>
-              <w:left w:val="single" w:color="000000" w:sz="6"/>
-              <w:bottom w:val="none" w:color="FFFFFF" w:sz="0"/>
+              <w:top w:val="single" w:color="000000" w:sz="6"/>
+              <w:left w:val="single" w:color="000000" w:sz="6"/>
+              <w:bottom w:val="single" w:color="000000" w:sz="6"/>
               <w:right w:val="single" w:color="000000" w:sz="6"/>
             </w:tcBorders>
             <w:tcMar>
@@ -1813,9 +1813,9 @@
           <w:tcPr>
             <w:tcW w:type="dxa" w:w="4678"/>
             <w:tcBorders>
-              <w:top w:val="none" w:color="FFFFFF" w:sz="0"/>
-              <w:left w:val="single" w:color="000000" w:sz="6"/>
-              <w:bottom w:val="none" w:color="FFFFFF" w:sz="0"/>
+              <w:top w:val="single" w:color="000000" w:sz="6"/>
+              <w:left w:val="single" w:color="000000" w:sz="6"/>
+              <w:bottom w:val="single" w:color="000000" w:sz="6"/>
               <w:right w:val="single" w:color="000000" w:sz="6"/>
             </w:tcBorders>
             <w:tcMar>
@@ -1849,9 +1849,9 @@
           <w:tcPr>
             <w:tcW w:type="dxa" w:w="4678"/>
             <w:tcBorders>
-              <w:top w:val="none" w:color="FFFFFF" w:sz="0"/>
-              <w:left w:val="single" w:color="000000" w:sz="6"/>
-              <w:bottom w:val="none" w:color="FFFFFF" w:sz="0"/>
+              <w:top w:val="single" w:color="000000" w:sz="6"/>
+              <w:left w:val="single" w:color="000000" w:sz="6"/>
+              <w:bottom w:val="single" w:color="000000" w:sz="6"/>
               <w:right w:val="single" w:color="000000" w:sz="6"/>
             </w:tcBorders>
             <w:tcMar>
@@ -1883,14 +1883,6 @@
         </w:tc>
       </w:tr>
     </w:tbl>
-    <w:p>
-      <w:pPr>
-        <w:pBdr>
-          <w:top w:val="single" w:color="000000" w:sz="6"/>
-        </w:pBdr>
-        <w:spacing w:before="0" w:after="0"/>
-      </w:pPr>
-    </w:p>
     <w:p>
       <w:pPr>
         <w:spacing w:line="276" w:before="120" w:after="0"/>

</xml_diff>

<commit_message>
feat(khbd): chuan hoa loi lap chu the va can hang bang doan trong
</commit_message>
<xml_diff>
--- a/khbd-renderer/KHBD_output.docx
+++ b/khbd-renderer/KHBD_output.docx
@@ -4,7 +4,7 @@
   <w:body>
     <w:p>
       <w:pPr>
-        <w:spacing w:line="276" w:after="0"/>
+        <w:spacing w:line="276" w:lineRule="exactly" w:before="0" w:after="0"/>
         <w:jc w:val="center"/>
       </w:pPr>
       <w:r>
@@ -23,7 +23,7 @@
         <w:tabs>
           <w:tab w:val="center" w:pos="4678"/>
         </w:tabs>
-        <w:spacing w:line="276" w:after="0"/>
+        <w:spacing w:line="276" w:lineRule="exactly" w:before="0" w:after="0"/>
         <w:jc w:val="center"/>
       </w:pPr>
       <w:r>
@@ -57,7 +57,7 @@
     </w:p>
     <w:p>
       <w:pPr>
-        <w:spacing w:line="276" w:after="0"/>
+        <w:spacing w:line="276" w:lineRule="exactly" w:before="0" w:after="0"/>
         <w:jc w:val="center"/>
       </w:pPr>
       <w:r>
@@ -73,7 +73,7 @@
     </w:p>
     <w:p>
       <w:pPr>
-        <w:spacing w:line="276" w:after="0"/>
+        <w:spacing w:line="276" w:lineRule="exactly" w:before="0" w:after="0"/>
         <w:jc w:val="center"/>
       </w:pPr>
       <w:r>
@@ -87,19 +87,19 @@
     </w:p>
     <w:p>
       <w:pPr>
-        <w:spacing w:line="276" w:after="0"/>
-      </w:pPr>
-      <w:r>
-        <w:rPr>
-          <w:sz w:val="28"/>
-          <w:szCs w:val="28"/>
-          <w:rFonts w:ascii="Times New Roman" w:cs="Times New Roman" w:eastAsia="Times New Roman" w:hAnsi="Times New Roman"/>
-        </w:rPr>
-      </w:r>
-    </w:p>
-    <w:p>
-      <w:pPr>
-        <w:spacing w:line="276" w:before="120" w:after="0"/>
+        <w:spacing w:line="276" w:lineRule="exactly" w:before="0" w:after="0"/>
+      </w:pPr>
+      <w:r>
+        <w:rPr>
+          <w:sz w:val="28"/>
+          <w:szCs w:val="28"/>
+          <w:rFonts w:ascii="Times New Roman" w:cs="Times New Roman" w:eastAsia="Times New Roman" w:hAnsi="Times New Roman"/>
+        </w:rPr>
+      </w:r>
+    </w:p>
+    <w:p>
+      <w:pPr>
+        <w:spacing w:line="276" w:lineRule="exactly" w:before="0" w:after="0"/>
       </w:pPr>
       <w:r>
         <w:rPr>
@@ -114,7 +114,7 @@
     </w:p>
     <w:p>
       <w:pPr>
-        <w:spacing w:line="276" w:after="0"/>
+        <w:spacing w:line="276" w:lineRule="exactly" w:before="0" w:after="0"/>
       </w:pPr>
       <w:r>
         <w:rPr>
@@ -129,7 +129,7 @@
     </w:p>
     <w:p>
       <w:pPr>
-        <w:spacing w:line="276" w:after="60"/>
+        <w:spacing w:line="276" w:lineRule="exactly" w:before="0" w:after="0"/>
         <w:jc w:val="both"/>
       </w:pPr>
       <w:r>
@@ -143,7 +143,7 @@
     </w:p>
     <w:p>
       <w:pPr>
-        <w:spacing w:line="276" w:after="60"/>
+        <w:spacing w:line="276" w:lineRule="exactly" w:before="0" w:after="0"/>
         <w:jc w:val="both"/>
       </w:pPr>
       <w:r>
@@ -157,7 +157,7 @@
     </w:p>
     <w:p>
       <w:pPr>
-        <w:spacing w:line="276" w:after="0"/>
+        <w:spacing w:line="276" w:lineRule="exactly" w:before="0" w:after="0"/>
         <w:jc w:val="both"/>
       </w:pPr>
       <w:r>
@@ -181,7 +181,7 @@
     </w:p>
     <w:p>
       <w:pPr>
-        <w:spacing w:line="276" w:after="0"/>
+        <w:spacing w:line="276" w:lineRule="exactly" w:before="0" w:after="0"/>
       </w:pPr>
       <w:r>
         <w:rPr>
@@ -204,7 +204,7 @@
     </w:p>
     <w:p>
       <w:pPr>
-        <w:spacing w:line="276" w:after="0"/>
+        <w:spacing w:line="276" w:lineRule="exactly" w:before="0" w:after="0"/>
       </w:pPr>
       <w:r>
         <w:rPr>
@@ -221,7 +221,7 @@
     </w:p>
     <w:p>
       <w:pPr>
-        <w:spacing w:line="276" w:after="60"/>
+        <w:spacing w:line="276" w:lineRule="exactly" w:before="0" w:after="0"/>
         <w:jc w:val="both"/>
       </w:pPr>
       <w:r>
@@ -235,7 +235,7 @@
     </w:p>
     <w:p>
       <w:pPr>
-        <w:spacing w:line="276" w:after="60"/>
+        <w:spacing w:line="276" w:lineRule="exactly" w:before="0" w:after="0"/>
         <w:jc w:val="both"/>
       </w:pPr>
       <w:r>
@@ -249,7 +249,7 @@
     </w:p>
     <w:p>
       <w:pPr>
-        <w:spacing w:line="276" w:before="120" w:after="0"/>
+        <w:spacing w:line="276" w:lineRule="exactly" w:before="0" w:after="0"/>
       </w:pPr>
       <w:r>
         <w:rPr>
@@ -264,7 +264,7 @@
     </w:p>
     <w:p>
       <w:pPr>
-        <w:spacing w:line="276" w:after="60"/>
+        <w:spacing w:line="276" w:lineRule="exactly" w:before="0" w:after="0"/>
         <w:jc w:val="both"/>
       </w:pPr>
       <w:r>
@@ -278,7 +278,7 @@
     </w:p>
     <w:p>
       <w:pPr>
-        <w:spacing w:line="276" w:after="60"/>
+        <w:spacing w:line="276" w:lineRule="exactly" w:before="0" w:after="0"/>
         <w:jc w:val="both"/>
       </w:pPr>
       <w:r>
@@ -292,7 +292,7 @@
     </w:p>
     <w:p>
       <w:pPr>
-        <w:spacing w:line="276" w:before="120" w:after="0"/>
+        <w:spacing w:line="276" w:lineRule="exactly" w:before="0" w:after="0"/>
       </w:pPr>
       <w:r>
         <w:rPr>
@@ -341,7 +341,7 @@
           </w:tcPr>
           <w:p>
             <w:pPr>
-              <w:spacing w:line="276" w:after="0"/>
+              <w:spacing w:line="276" w:lineRule="exactly" w:before="0" w:after="0"/>
               <w:jc w:val="center"/>
             </w:pPr>
             <w:r>
@@ -375,7 +375,7 @@
           </w:tcPr>
           <w:p>
             <w:pPr>
-              <w:spacing w:line="276" w:after="0"/>
+              <w:spacing w:line="276" w:lineRule="exactly" w:before="0" w:after="0"/>
               <w:jc w:val="center"/>
             </w:pPr>
             <w:r>
@@ -410,7 +410,7 @@
           </w:tcPr>
           <w:p>
             <w:pPr>
-              <w:spacing w:line="276" w:before="40" w:after="60"/>
+              <w:spacing w:line="276" w:lineRule="exactly" w:before="0" w:after="0"/>
             </w:pPr>
             <w:r>
               <w:rPr>
@@ -425,7 +425,7 @@
           </w:p>
           <w:p>
             <w:pPr>
-              <w:spacing w:line="276" w:after="60"/>
+              <w:spacing w:line="276" w:lineRule="exactly" w:before="0" w:after="0"/>
               <w:jc w:val="both"/>
             </w:pPr>
             <w:r>
@@ -439,7 +439,7 @@
           </w:p>
           <w:p>
             <w:pPr>
-              <w:spacing w:line="276" w:after="60"/>
+              <w:spacing w:line="276" w:lineRule="exactly" w:before="0" w:after="0"/>
               <w:jc w:val="both"/>
             </w:pPr>
             <w:r>
@@ -453,7 +453,7 @@
           </w:p>
           <w:p>
             <w:pPr>
-              <w:spacing w:line="276" w:after="336"/>
+              <w:spacing w:line="276" w:lineRule="exactly" w:before="0" w:after="0"/>
               <w:jc w:val="both"/>
             </w:pPr>
             <w:r>
@@ -467,7 +467,7 @@
           </w:p>
           <w:p>
             <w:pPr>
-              <w:spacing w:line="276" w:after="60"/>
+              <w:spacing w:line="276" w:lineRule="exactly" w:before="0" w:after="0"/>
               <w:jc w:val="both"/>
             </w:pPr>
             <w:r>
@@ -481,7 +481,19 @@
           </w:p>
           <w:p>
             <w:pPr>
-              <w:spacing w:line="276" w:before="140" w:after="60"/>
+              <w:spacing w:line="276" w:lineRule="exactly" w:before="0" w:after="0"/>
+            </w:pPr>
+            <w:r>
+              <w:rPr>
+                <w:sz w:val="28"/>
+                <w:szCs w:val="28"/>
+                <w:rFonts w:ascii="Times New Roman" w:cs="Times New Roman" w:eastAsia="Times New Roman" w:hAnsi="Times New Roman"/>
+              </w:rPr>
+            </w:r>
+          </w:p>
+          <w:p>
+            <w:pPr>
+              <w:spacing w:line="276" w:lineRule="exactly" w:before="0" w:after="0"/>
             </w:pPr>
             <w:r>
               <w:rPr>
@@ -496,7 +508,7 @@
           </w:p>
           <w:p>
             <w:pPr>
-              <w:spacing w:line="276" w:after="60"/>
+              <w:spacing w:line="276" w:lineRule="exactly" w:before="0" w:after="0"/>
               <w:jc w:val="both"/>
             </w:pPr>
             <w:r>
@@ -510,7 +522,7 @@
           </w:p>
           <w:p>
             <w:pPr>
-              <w:spacing w:line="276" w:after="60"/>
+              <w:spacing w:line="276" w:lineRule="exactly" w:before="0" w:after="0"/>
               <w:jc w:val="both"/>
             </w:pPr>
             <w:r>
@@ -524,7 +536,7 @@
           </w:p>
           <w:p>
             <w:pPr>
-              <w:spacing w:line="276" w:after="60"/>
+              <w:spacing w:line="276" w:lineRule="exactly" w:before="0" w:after="0"/>
               <w:jc w:val="both"/>
             </w:pPr>
             <w:r>
@@ -538,7 +550,7 @@
           </w:p>
           <w:p>
             <w:pPr>
-              <w:spacing w:line="276" w:after="60"/>
+              <w:spacing w:line="276" w:lineRule="exactly" w:before="0" w:after="0"/>
               <w:jc w:val="both"/>
             </w:pPr>
             <w:r>
@@ -552,7 +564,7 @@
           </w:p>
           <w:p>
             <w:pPr>
-              <w:spacing w:line="276" w:after="60"/>
+              <w:spacing w:line="276" w:lineRule="exactly" w:before="0" w:after="0"/>
               <w:jc w:val="both"/>
             </w:pPr>
             <w:r>
@@ -566,7 +578,7 @@
           </w:p>
           <w:p>
             <w:pPr>
-              <w:spacing w:line="276" w:after="60"/>
+              <w:spacing w:line="276" w:lineRule="exactly" w:before="0" w:after="0"/>
               <w:jc w:val="both"/>
             </w:pPr>
             <w:r>
@@ -580,7 +592,7 @@
           </w:p>
           <w:p>
             <w:pPr>
-              <w:spacing w:line="276" w:after="60"/>
+              <w:spacing w:line="276" w:lineRule="exactly" w:before="0" w:after="0"/>
               <w:jc w:val="both"/>
             </w:pPr>
             <w:r>
@@ -594,7 +606,7 @@
           </w:p>
           <w:p>
             <w:pPr>
-              <w:spacing w:line="276" w:after="60"/>
+              <w:spacing w:line="276" w:lineRule="exactly" w:before="0" w:after="0"/>
               <w:jc w:val="both"/>
             </w:pPr>
             <w:r>
@@ -608,7 +620,19 @@
           </w:p>
           <w:p>
             <w:pPr>
-              <w:spacing w:line="276" w:before="140" w:after="60"/>
+              <w:spacing w:line="276" w:lineRule="exactly" w:before="0" w:after="0"/>
+            </w:pPr>
+            <w:r>
+              <w:rPr>
+                <w:sz w:val="28"/>
+                <w:szCs w:val="28"/>
+                <w:rFonts w:ascii="Times New Roman" w:cs="Times New Roman" w:eastAsia="Times New Roman" w:hAnsi="Times New Roman"/>
+              </w:rPr>
+            </w:r>
+          </w:p>
+          <w:p>
+            <w:pPr>
+              <w:spacing w:line="276" w:lineRule="exactly" w:before="0" w:after="0"/>
             </w:pPr>
             <w:r>
               <w:rPr>
@@ -623,7 +647,7 @@
           </w:p>
           <w:p>
             <w:pPr>
-              <w:spacing w:line="276" w:after="60"/>
+              <w:spacing w:line="276" w:lineRule="exactly" w:before="0" w:after="0"/>
               <w:jc w:val="both"/>
             </w:pPr>
             <w:r>
@@ -637,7 +661,7 @@
           </w:p>
           <w:p>
             <w:pPr>
-              <w:spacing w:line="276" w:after="60"/>
+              <w:spacing w:line="276" w:lineRule="exactly" w:before="0" w:after="0"/>
               <w:jc w:val="both"/>
             </w:pPr>
             <w:r>
@@ -651,7 +675,7 @@
           </w:p>
           <w:p>
             <w:pPr>
-              <w:spacing w:line="276" w:after="60"/>
+              <w:spacing w:line="276" w:lineRule="exactly" w:before="0" w:after="0"/>
               <w:jc w:val="both"/>
             </w:pPr>
             <w:r>
@@ -665,7 +689,19 @@
           </w:p>
           <w:p>
             <w:pPr>
-              <w:spacing w:line="276" w:before="140" w:after="60"/>
+              <w:spacing w:line="276" w:lineRule="exactly" w:before="0" w:after="0"/>
+            </w:pPr>
+            <w:r>
+              <w:rPr>
+                <w:sz w:val="28"/>
+                <w:szCs w:val="28"/>
+                <w:rFonts w:ascii="Times New Roman" w:cs="Times New Roman" w:eastAsia="Times New Roman" w:hAnsi="Times New Roman"/>
+              </w:rPr>
+            </w:r>
+          </w:p>
+          <w:p>
+            <w:pPr>
+              <w:spacing w:line="276" w:lineRule="exactly" w:before="0" w:after="0"/>
             </w:pPr>
             <w:r>
               <w:rPr>
@@ -680,7 +716,7 @@
           </w:p>
           <w:p>
             <w:pPr>
-              <w:spacing w:line="276" w:after="60"/>
+              <w:spacing w:line="276" w:lineRule="exactly" w:before="0" w:after="0"/>
               <w:jc w:val="both"/>
             </w:pPr>
             <w:r>
@@ -694,7 +730,7 @@
           </w:p>
           <w:p>
             <w:pPr>
-              <w:spacing w:line="276" w:after="60"/>
+              <w:spacing w:line="276" w:lineRule="exactly" w:before="0" w:after="0"/>
               <w:jc w:val="both"/>
             </w:pPr>
             <w:r>
@@ -725,19 +761,19 @@
           </w:tcPr>
           <w:p>
             <w:pPr>
-              <w:spacing w:line="276" w:before="40" w:after="60"/>
-            </w:pPr>
-            <w:r>
-              <w:rPr>
-                <w:sz w:val="28"/>
-                <w:szCs w:val="28"/>
-                <w:rFonts w:ascii="Times New Roman" w:cs="Times New Roman" w:eastAsia="Times New Roman" w:hAnsi="Times New Roman"/>
-              </w:rPr>
-            </w:r>
-          </w:p>
-          <w:p>
-            <w:pPr>
-              <w:spacing w:line="276" w:after="336"/>
+              <w:spacing w:line="276" w:lineRule="exactly" w:before="0" w:after="0"/>
+            </w:pPr>
+            <w:r>
+              <w:rPr>
+                <w:sz w:val="28"/>
+                <w:szCs w:val="28"/>
+                <w:rFonts w:ascii="Times New Roman" w:cs="Times New Roman" w:eastAsia="Times New Roman" w:hAnsi="Times New Roman"/>
+              </w:rPr>
+            </w:r>
+          </w:p>
+          <w:p>
+            <w:pPr>
+              <w:spacing w:line="276" w:lineRule="exactly" w:before="0" w:after="0"/>
               <w:jc w:val="both"/>
             </w:pPr>
             <w:r>
@@ -751,7 +787,19 @@
           </w:p>
           <w:p>
             <w:pPr>
-              <w:spacing w:line="276" w:after="336"/>
+              <w:spacing w:line="276" w:lineRule="exactly" w:before="0" w:after="0"/>
+            </w:pPr>
+            <w:r>
+              <w:rPr>
+                <w:sz w:val="28"/>
+                <w:szCs w:val="28"/>
+                <w:rFonts w:ascii="Times New Roman" w:cs="Times New Roman" w:eastAsia="Times New Roman" w:hAnsi="Times New Roman"/>
+              </w:rPr>
+            </w:r>
+          </w:p>
+          <w:p>
+            <w:pPr>
+              <w:spacing w:line="276" w:lineRule="exactly" w:before="0" w:after="0"/>
               <w:jc w:val="both"/>
             </w:pPr>
             <w:r>
@@ -765,7 +813,19 @@
           </w:p>
           <w:p>
             <w:pPr>
-              <w:spacing w:line="276" w:after="60"/>
+              <w:spacing w:line="276" w:lineRule="exactly" w:before="0" w:after="0"/>
+            </w:pPr>
+            <w:r>
+              <w:rPr>
+                <w:sz w:val="28"/>
+                <w:szCs w:val="28"/>
+                <w:rFonts w:ascii="Times New Roman" w:cs="Times New Roman" w:eastAsia="Times New Roman" w:hAnsi="Times New Roman"/>
+              </w:rPr>
+            </w:r>
+          </w:p>
+          <w:p>
+            <w:pPr>
+              <w:spacing w:line="276" w:lineRule="exactly" w:before="0" w:after="0"/>
               <w:jc w:val="both"/>
             </w:pPr>
             <w:r>
@@ -779,7 +839,7 @@
           </w:p>
           <w:p>
             <w:pPr>
-              <w:spacing w:line="276" w:after="612"/>
+              <w:spacing w:line="276" w:lineRule="exactly" w:before="0" w:after="0"/>
               <w:jc w:val="both"/>
             </w:pPr>
             <w:r>
@@ -793,19 +853,43 @@
           </w:p>
           <w:p>
             <w:pPr>
-              <w:spacing w:line="276" w:before="140" w:after="60"/>
-            </w:pPr>
-            <w:r>
-              <w:rPr>
-                <w:sz w:val="28"/>
-                <w:szCs w:val="28"/>
-                <w:rFonts w:ascii="Times New Roman" w:cs="Times New Roman" w:eastAsia="Times New Roman" w:hAnsi="Times New Roman"/>
-              </w:rPr>
-            </w:r>
-          </w:p>
-          <w:p>
-            <w:pPr>
-              <w:spacing w:line="276" w:after="336"/>
+              <w:spacing w:line="276" w:lineRule="exactly" w:before="0" w:after="0"/>
+            </w:pPr>
+            <w:r>
+              <w:rPr>
+                <w:sz w:val="28"/>
+                <w:szCs w:val="28"/>
+                <w:rFonts w:ascii="Times New Roman" w:cs="Times New Roman" w:eastAsia="Times New Roman" w:hAnsi="Times New Roman"/>
+              </w:rPr>
+            </w:r>
+          </w:p>
+          <w:p>
+            <w:pPr>
+              <w:spacing w:line="276" w:lineRule="exactly" w:before="0" w:after="0"/>
+            </w:pPr>
+            <w:r>
+              <w:rPr>
+                <w:sz w:val="28"/>
+                <w:szCs w:val="28"/>
+                <w:rFonts w:ascii="Times New Roman" w:cs="Times New Roman" w:eastAsia="Times New Roman" w:hAnsi="Times New Roman"/>
+              </w:rPr>
+            </w:r>
+          </w:p>
+          <w:p>
+            <w:pPr>
+              <w:spacing w:line="276" w:lineRule="exactly" w:before="0" w:after="0"/>
+            </w:pPr>
+            <w:r>
+              <w:rPr>
+                <w:sz w:val="28"/>
+                <w:szCs w:val="28"/>
+                <w:rFonts w:ascii="Times New Roman" w:cs="Times New Roman" w:eastAsia="Times New Roman" w:hAnsi="Times New Roman"/>
+              </w:rPr>
+            </w:r>
+          </w:p>
+          <w:p>
+            <w:pPr>
+              <w:spacing w:line="276" w:lineRule="exactly" w:before="0" w:after="0"/>
               <w:jc w:val="both"/>
             </w:pPr>
             <w:r>
@@ -819,7 +903,19 @@
           </w:p>
           <w:p>
             <w:pPr>
-              <w:spacing w:line="276" w:after="60"/>
+              <w:spacing w:line="276" w:lineRule="exactly" w:before="0" w:after="0"/>
+            </w:pPr>
+            <w:r>
+              <w:rPr>
+                <w:sz w:val="28"/>
+                <w:szCs w:val="28"/>
+                <w:rFonts w:ascii="Times New Roman" w:cs="Times New Roman" w:eastAsia="Times New Roman" w:hAnsi="Times New Roman"/>
+              </w:rPr>
+            </w:r>
+          </w:p>
+          <w:p>
+            <w:pPr>
+              <w:spacing w:line="276" w:lineRule="exactly" w:before="0" w:after="0"/>
               <w:jc w:val="both"/>
             </w:pPr>
             <w:r>
@@ -833,7 +929,7 @@
           </w:p>
           <w:p>
             <w:pPr>
-              <w:spacing w:line="276" w:after="336"/>
+              <w:spacing w:line="276" w:lineRule="exactly" w:before="0" w:after="0"/>
               <w:jc w:val="both"/>
             </w:pPr>
             <w:r>
@@ -847,7 +943,19 @@
           </w:p>
           <w:p>
             <w:pPr>
-              <w:spacing w:line="276" w:after="336"/>
+              <w:spacing w:line="276" w:lineRule="exactly" w:before="0" w:after="0"/>
+            </w:pPr>
+            <w:r>
+              <w:rPr>
+                <w:sz w:val="28"/>
+                <w:szCs w:val="28"/>
+                <w:rFonts w:ascii="Times New Roman" w:cs="Times New Roman" w:eastAsia="Times New Roman" w:hAnsi="Times New Roman"/>
+              </w:rPr>
+            </w:r>
+          </w:p>
+          <w:p>
+            <w:pPr>
+              <w:spacing w:line="276" w:lineRule="exactly" w:before="0" w:after="0"/>
               <w:jc w:val="both"/>
             </w:pPr>
             <w:r>
@@ -861,7 +969,7 @@
           </w:p>
           <w:p>
             <w:pPr>
-              <w:spacing w:line="276" w:after="336"/>
+              <w:spacing w:line="276" w:lineRule="exactly" w:before="0" w:after="0"/>
               <w:jc w:val="both"/>
             </w:pPr>
             <w:r>
@@ -875,7 +983,19 @@
           </w:p>
           <w:p>
             <w:pPr>
-              <w:spacing w:line="276" w:after="612"/>
+              <w:spacing w:line="276" w:lineRule="exactly" w:before="0" w:after="0"/>
+            </w:pPr>
+            <w:r>
+              <w:rPr>
+                <w:sz w:val="28"/>
+                <w:szCs w:val="28"/>
+                <w:rFonts w:ascii="Times New Roman" w:cs="Times New Roman" w:eastAsia="Times New Roman" w:hAnsi="Times New Roman"/>
+              </w:rPr>
+            </w:r>
+          </w:p>
+          <w:p>
+            <w:pPr>
+              <w:spacing w:line="276" w:lineRule="exactly" w:before="0" w:after="0"/>
               <w:jc w:val="both"/>
             </w:pPr>
             <w:r>
@@ -889,7 +1009,31 @@
           </w:p>
           <w:p>
             <w:pPr>
-              <w:spacing w:line="276" w:after="888"/>
+              <w:spacing w:line="276" w:lineRule="exactly" w:before="0" w:after="0"/>
+            </w:pPr>
+            <w:r>
+              <w:rPr>
+                <w:sz w:val="28"/>
+                <w:szCs w:val="28"/>
+                <w:rFonts w:ascii="Times New Roman" w:cs="Times New Roman" w:eastAsia="Times New Roman" w:hAnsi="Times New Roman"/>
+              </w:rPr>
+            </w:r>
+          </w:p>
+          <w:p>
+            <w:pPr>
+              <w:spacing w:line="276" w:lineRule="exactly" w:before="0" w:after="0"/>
+            </w:pPr>
+            <w:r>
+              <w:rPr>
+                <w:sz w:val="28"/>
+                <w:szCs w:val="28"/>
+                <w:rFonts w:ascii="Times New Roman" w:cs="Times New Roman" w:eastAsia="Times New Roman" w:hAnsi="Times New Roman"/>
+              </w:rPr>
+            </w:r>
+          </w:p>
+          <w:p>
+            <w:pPr>
+              <w:spacing w:line="276" w:lineRule="exactly" w:before="0" w:after="0"/>
               <w:jc w:val="both"/>
             </w:pPr>
             <w:r>
@@ -903,7 +1047,43 @@
           </w:p>
           <w:p>
             <w:pPr>
-              <w:spacing w:line="276" w:after="336"/>
+              <w:spacing w:line="276" w:lineRule="exactly" w:before="0" w:after="0"/>
+            </w:pPr>
+            <w:r>
+              <w:rPr>
+                <w:sz w:val="28"/>
+                <w:szCs w:val="28"/>
+                <w:rFonts w:ascii="Times New Roman" w:cs="Times New Roman" w:eastAsia="Times New Roman" w:hAnsi="Times New Roman"/>
+              </w:rPr>
+            </w:r>
+          </w:p>
+          <w:p>
+            <w:pPr>
+              <w:spacing w:line="276" w:lineRule="exactly" w:before="0" w:after="0"/>
+            </w:pPr>
+            <w:r>
+              <w:rPr>
+                <w:sz w:val="28"/>
+                <w:szCs w:val="28"/>
+                <w:rFonts w:ascii="Times New Roman" w:cs="Times New Roman" w:eastAsia="Times New Roman" w:hAnsi="Times New Roman"/>
+              </w:rPr>
+            </w:r>
+          </w:p>
+          <w:p>
+            <w:pPr>
+              <w:spacing w:line="276" w:lineRule="exactly" w:before="0" w:after="0"/>
+            </w:pPr>
+            <w:r>
+              <w:rPr>
+                <w:sz w:val="28"/>
+                <w:szCs w:val="28"/>
+                <w:rFonts w:ascii="Times New Roman" w:cs="Times New Roman" w:eastAsia="Times New Roman" w:hAnsi="Times New Roman"/>
+              </w:rPr>
+            </w:r>
+          </w:p>
+          <w:p>
+            <w:pPr>
+              <w:spacing w:line="276" w:lineRule="exactly" w:before="0" w:after="0"/>
               <w:jc w:val="both"/>
             </w:pPr>
             <w:r>
@@ -917,19 +1097,31 @@
           </w:p>
           <w:p>
             <w:pPr>
-              <w:spacing w:line="276" w:before="140" w:after="60"/>
-            </w:pPr>
-            <w:r>
-              <w:rPr>
-                <w:sz w:val="28"/>
-                <w:szCs w:val="28"/>
-                <w:rFonts w:ascii="Times New Roman" w:cs="Times New Roman" w:eastAsia="Times New Roman" w:hAnsi="Times New Roman"/>
-              </w:rPr>
-            </w:r>
-          </w:p>
-          <w:p>
-            <w:pPr>
-              <w:spacing w:line="276" w:after="612"/>
+              <w:spacing w:line="276" w:lineRule="exactly" w:before="0" w:after="0"/>
+            </w:pPr>
+            <w:r>
+              <w:rPr>
+                <w:sz w:val="28"/>
+                <w:szCs w:val="28"/>
+                <w:rFonts w:ascii="Times New Roman" w:cs="Times New Roman" w:eastAsia="Times New Roman" w:hAnsi="Times New Roman"/>
+              </w:rPr>
+            </w:r>
+          </w:p>
+          <w:p>
+            <w:pPr>
+              <w:spacing w:line="276" w:lineRule="exactly" w:before="0" w:after="0"/>
+            </w:pPr>
+            <w:r>
+              <w:rPr>
+                <w:sz w:val="28"/>
+                <w:szCs w:val="28"/>
+                <w:rFonts w:ascii="Times New Roman" w:cs="Times New Roman" w:eastAsia="Times New Roman" w:hAnsi="Times New Roman"/>
+              </w:rPr>
+            </w:r>
+          </w:p>
+          <w:p>
+            <w:pPr>
+              <w:spacing w:line="276" w:lineRule="exactly" w:before="0" w:after="0"/>
               <w:jc w:val="both"/>
             </w:pPr>
             <w:r>
@@ -943,7 +1135,19 @@
           </w:p>
           <w:p>
             <w:pPr>
-              <w:spacing w:line="276" w:after="336"/>
+              <w:spacing w:line="276" w:lineRule="exactly" w:before="0" w:after="0"/>
+            </w:pPr>
+            <w:r>
+              <w:rPr>
+                <w:sz w:val="28"/>
+                <w:szCs w:val="28"/>
+                <w:rFonts w:ascii="Times New Roman" w:cs="Times New Roman" w:eastAsia="Times New Roman" w:hAnsi="Times New Roman"/>
+              </w:rPr>
+            </w:r>
+          </w:p>
+          <w:p>
+            <w:pPr>
+              <w:spacing w:line="276" w:lineRule="exactly" w:before="0" w:after="0"/>
               <w:jc w:val="both"/>
             </w:pPr>
             <w:r>
@@ -957,7 +1161,19 @@
           </w:p>
           <w:p>
             <w:pPr>
-              <w:spacing w:line="276" w:after="60"/>
+              <w:spacing w:line="276" w:lineRule="exactly" w:before="0" w:after="0"/>
+            </w:pPr>
+            <w:r>
+              <w:rPr>
+                <w:sz w:val="28"/>
+                <w:szCs w:val="28"/>
+                <w:rFonts w:ascii="Times New Roman" w:cs="Times New Roman" w:eastAsia="Times New Roman" w:hAnsi="Times New Roman"/>
+              </w:rPr>
+            </w:r>
+          </w:p>
+          <w:p>
+            <w:pPr>
+              <w:spacing w:line="276" w:lineRule="exactly" w:before="0" w:after="0"/>
               <w:jc w:val="both"/>
             </w:pPr>
             <w:r>
@@ -971,19 +1187,31 @@
           </w:p>
           <w:p>
             <w:pPr>
-              <w:spacing w:line="276" w:before="140" w:after="60"/>
-            </w:pPr>
-            <w:r>
-              <w:rPr>
-                <w:sz w:val="28"/>
-                <w:szCs w:val="28"/>
-                <w:rFonts w:ascii="Times New Roman" w:cs="Times New Roman" w:eastAsia="Times New Roman" w:hAnsi="Times New Roman"/>
-              </w:rPr>
-            </w:r>
-          </w:p>
-          <w:p>
-            <w:pPr>
-              <w:spacing w:line="276" w:after="612"/>
+              <w:spacing w:line="276" w:lineRule="exactly" w:before="0" w:after="0"/>
+            </w:pPr>
+            <w:r>
+              <w:rPr>
+                <w:sz w:val="28"/>
+                <w:szCs w:val="28"/>
+                <w:rFonts w:ascii="Times New Roman" w:cs="Times New Roman" w:eastAsia="Times New Roman" w:hAnsi="Times New Roman"/>
+              </w:rPr>
+            </w:r>
+          </w:p>
+          <w:p>
+            <w:pPr>
+              <w:spacing w:line="276" w:lineRule="exactly" w:before="0" w:after="0"/>
+            </w:pPr>
+            <w:r>
+              <w:rPr>
+                <w:sz w:val="28"/>
+                <w:szCs w:val="28"/>
+                <w:rFonts w:ascii="Times New Roman" w:cs="Times New Roman" w:eastAsia="Times New Roman" w:hAnsi="Times New Roman"/>
+              </w:rPr>
+            </w:r>
+          </w:p>
+          <w:p>
+            <w:pPr>
+              <w:spacing w:line="276" w:lineRule="exactly" w:before="0" w:after="0"/>
               <w:jc w:val="both"/>
             </w:pPr>
             <w:r>
@@ -997,7 +1225,43 @@
           </w:p>
           <w:p>
             <w:pPr>
-              <w:spacing w:line="276" w:after="60"/>
+              <w:spacing w:line="276" w:lineRule="exactly" w:before="0" w:after="0"/>
+            </w:pPr>
+            <w:r>
+              <w:rPr>
+                <w:sz w:val="28"/>
+                <w:szCs w:val="28"/>
+                <w:rFonts w:ascii="Times New Roman" w:cs="Times New Roman" w:eastAsia="Times New Roman" w:hAnsi="Times New Roman"/>
+              </w:rPr>
+            </w:r>
+          </w:p>
+          <w:p>
+            <w:pPr>
+              <w:spacing w:line="276" w:lineRule="exactly" w:before="0" w:after="0"/>
+            </w:pPr>
+            <w:r>
+              <w:rPr>
+                <w:sz w:val="28"/>
+                <w:szCs w:val="28"/>
+                <w:rFonts w:ascii="Times New Roman" w:cs="Times New Roman" w:eastAsia="Times New Roman" w:hAnsi="Times New Roman"/>
+              </w:rPr>
+            </w:r>
+          </w:p>
+          <w:p>
+            <w:pPr>
+              <w:spacing w:line="276" w:lineRule="exactly" w:before="0" w:after="0"/>
+            </w:pPr>
+            <w:r>
+              <w:rPr>
+                <w:sz w:val="28"/>
+                <w:szCs w:val="28"/>
+                <w:rFonts w:ascii="Times New Roman" w:cs="Times New Roman" w:eastAsia="Times New Roman" w:hAnsi="Times New Roman"/>
+              </w:rPr>
+            </w:r>
+          </w:p>
+          <w:p>
+            <w:pPr>
+              <w:spacing w:line="276" w:lineRule="exactly" w:before="0" w:after="0"/>
               <w:jc w:val="both"/>
             </w:pPr>
             <w:r>
@@ -1007,6 +1271,18 @@
                 <w:rFonts w:ascii="Times New Roman" w:cs="Times New Roman" w:eastAsia="Times New Roman" w:hAnsi="Times New Roman"/>
               </w:rPr>
               <w:t xml:space="preserve">- HS ghi nhớ; hứa chia sẻ kết quả vào buổi học sau.</w:t>
+            </w:r>
+          </w:p>
+          <w:p>
+            <w:pPr>
+              <w:spacing w:line="276" w:lineRule="exactly" w:before="0" w:after="0"/>
+            </w:pPr>
+            <w:r>
+              <w:rPr>
+                <w:sz w:val="28"/>
+                <w:szCs w:val="28"/>
+                <w:rFonts w:ascii="Times New Roman" w:cs="Times New Roman" w:eastAsia="Times New Roman" w:hAnsi="Times New Roman"/>
+              </w:rPr>
             </w:r>
           </w:p>
         </w:tc>
@@ -1014,7 +1290,7 @@
     </w:tbl>
     <w:p>
       <w:pPr>
-        <w:spacing w:line="276" w:before="120" w:after="0"/>
+        <w:spacing w:line="276" w:lineRule="exactly" w:before="0" w:after="0"/>
       </w:pPr>
       <w:r>
         <w:rPr>
@@ -1032,7 +1308,7 @@
         <w:tabs>
           <w:tab w:val="right" w:pos="9356" w:leader="dot"/>
         </w:tabs>
-        <w:spacing w:line="276" w:after="0"/>
+        <w:spacing w:line="276" w:lineRule="exactly" w:before="0" w:after="0"/>
       </w:pPr>
       <w:r>
         <w:rPr>
@@ -1048,7 +1324,7 @@
         <w:tabs>
           <w:tab w:val="right" w:pos="9356" w:leader="dot"/>
         </w:tabs>
-        <w:spacing w:line="276" w:after="0"/>
+        <w:spacing w:line="276" w:lineRule="exactly" w:before="0" w:after="0"/>
       </w:pPr>
       <w:r>
         <w:rPr>

</xml_diff>

<commit_message>
feat(khbd): hang tieu de 2 o rieng biet khong gop cot, ten bai in hoa, bo sung prompt giu noi dung va GV/HS in hoa
</commit_message>
<xml_diff>
--- a/khbd-renderer/KHBD_output.docx
+++ b/khbd-renderer/KHBD_output.docx
@@ -394,8 +394,7 @@
       <w:tr>
         <w:tc>
           <w:tcPr>
-            <w:tcW w:type="dxa" w:w="9356"/>
-            <w:gridSpan w:val="2"/>
+            <w:tcW w:type="dxa" w:w="4678"/>
             <w:tcBorders>
               <w:top w:val="none" w:color="auto" w:sz="0"/>
               <w:left w:val="single" w:color="000000" w:sz="6"/>
@@ -403,7 +402,7 @@
               <w:right w:val="single" w:color="000000" w:sz="6"/>
             </w:tcBorders>
             <w:tcMar>
-              <w:top w:type="dxa" w:w="100"/>
+              <w:top w:type="dxa" w:w="80"/>
               <w:left w:type="dxa" w:w="100"/>
               <w:bottom w:type="dxa" w:w="60"/>
               <w:right w:type="dxa" w:w="100"/>
@@ -422,6 +421,35 @@
                 <w:rFonts w:ascii="Times New Roman" w:cs="Times New Roman" w:eastAsia="Times New Roman" w:hAnsi="Times New Roman"/>
               </w:rPr>
               <w:t xml:space="preserve">1. Khởi động: 5 phút</w:t>
+            </w:r>
+          </w:p>
+        </w:tc>
+        <w:tc>
+          <w:tcPr>
+            <w:tcW w:type="dxa" w:w="4678"/>
+            <w:tcBorders>
+              <w:top w:val="none" w:color="auto" w:sz="0"/>
+              <w:left w:val="single" w:color="000000" w:sz="6"/>
+              <w:bottom w:val="none" w:color="auto" w:sz="0"/>
+              <w:right w:val="single" w:color="000000" w:sz="6"/>
+            </w:tcBorders>
+            <w:tcMar>
+              <w:top w:type="dxa" w:w="80"/>
+              <w:left w:type="dxa" w:w="100"/>
+              <w:bottom w:type="dxa" w:w="60"/>
+              <w:right w:type="dxa" w:w="100"/>
+            </w:tcMar>
+          </w:tcPr>
+          <w:p>
+            <w:pPr>
+              <w:spacing w:line="276" w:lineRule="exactly" w:before="0" w:after="0"/>
+            </w:pPr>
+            <w:r>
+              <w:rPr>
+                <w:sz w:val="28"/>
+                <w:szCs w:val="28"/>
+                <w:rFonts w:ascii="Times New Roman" w:cs="Times New Roman" w:eastAsia="Times New Roman" w:hAnsi="Times New Roman"/>
+              </w:rPr>
             </w:r>
           </w:p>
         </w:tc>
@@ -613,8 +641,7 @@
       <w:tr>
         <w:tc>
           <w:tcPr>
-            <w:tcW w:type="dxa" w:w="9356"/>
-            <w:gridSpan w:val="2"/>
+            <w:tcW w:type="dxa" w:w="4678"/>
             <w:tcBorders>
               <w:top w:val="none" w:color="auto" w:sz="0"/>
               <w:left w:val="single" w:color="000000" w:sz="6"/>
@@ -622,7 +649,7 @@
               <w:right w:val="single" w:color="000000" w:sz="6"/>
             </w:tcBorders>
             <w:tcMar>
-              <w:top w:type="dxa" w:w="100"/>
+              <w:top w:type="dxa" w:w="80"/>
               <w:left w:type="dxa" w:w="100"/>
               <w:bottom w:type="dxa" w:w="60"/>
               <w:right w:type="dxa" w:w="100"/>
@@ -641,6 +668,35 @@
                 <w:rFonts w:ascii="Times New Roman" w:cs="Times New Roman" w:eastAsia="Times New Roman" w:hAnsi="Times New Roman"/>
               </w:rPr>
               <w:t xml:space="preserve">2. Khám phá: 15 phút</w:t>
+            </w:r>
+          </w:p>
+        </w:tc>
+        <w:tc>
+          <w:tcPr>
+            <w:tcW w:type="dxa" w:w="4678"/>
+            <w:tcBorders>
+              <w:top w:val="none" w:color="auto" w:sz="0"/>
+              <w:left w:val="single" w:color="000000" w:sz="6"/>
+              <w:bottom w:val="none" w:color="auto" w:sz="0"/>
+              <w:right w:val="single" w:color="000000" w:sz="6"/>
+            </w:tcBorders>
+            <w:tcMar>
+              <w:top w:type="dxa" w:w="80"/>
+              <w:left w:type="dxa" w:w="100"/>
+              <w:bottom w:type="dxa" w:w="60"/>
+              <w:right w:type="dxa" w:w="100"/>
+            </w:tcMar>
+          </w:tcPr>
+          <w:p>
+            <w:pPr>
+              <w:spacing w:line="276" w:lineRule="exactly" w:before="0" w:after="0"/>
+            </w:pPr>
+            <w:r>
+              <w:rPr>
+                <w:sz w:val="28"/>
+                <w:szCs w:val="28"/>
+                <w:rFonts w:ascii="Times New Roman" w:cs="Times New Roman" w:eastAsia="Times New Roman" w:hAnsi="Times New Roman"/>
+              </w:rPr>
             </w:r>
           </w:p>
         </w:tc>
@@ -1004,8 +1060,7 @@
       <w:tr>
         <w:tc>
           <w:tcPr>
-            <w:tcW w:type="dxa" w:w="9356"/>
-            <w:gridSpan w:val="2"/>
+            <w:tcW w:type="dxa" w:w="4678"/>
             <w:tcBorders>
               <w:top w:val="none" w:color="auto" w:sz="0"/>
               <w:left w:val="single" w:color="000000" w:sz="6"/>
@@ -1013,7 +1068,7 @@
               <w:right w:val="single" w:color="000000" w:sz="6"/>
             </w:tcBorders>
             <w:tcMar>
-              <w:top w:type="dxa" w:w="100"/>
+              <w:top w:type="dxa" w:w="80"/>
               <w:left w:type="dxa" w:w="100"/>
               <w:bottom w:type="dxa" w:w="60"/>
               <w:right w:type="dxa" w:w="100"/>
@@ -1032,6 +1087,35 @@
                 <w:rFonts w:ascii="Times New Roman" w:cs="Times New Roman" w:eastAsia="Times New Roman" w:hAnsi="Times New Roman"/>
               </w:rPr>
               <w:t xml:space="preserve">3. Luyện tập, thực hành: 10 phút</w:t>
+            </w:r>
+          </w:p>
+        </w:tc>
+        <w:tc>
+          <w:tcPr>
+            <w:tcW w:type="dxa" w:w="4678"/>
+            <w:tcBorders>
+              <w:top w:val="none" w:color="auto" w:sz="0"/>
+              <w:left w:val="single" w:color="000000" w:sz="6"/>
+              <w:bottom w:val="none" w:color="auto" w:sz="0"/>
+              <w:right w:val="single" w:color="000000" w:sz="6"/>
+            </w:tcBorders>
+            <w:tcMar>
+              <w:top w:type="dxa" w:w="80"/>
+              <w:left w:type="dxa" w:w="100"/>
+              <w:bottom w:type="dxa" w:w="60"/>
+              <w:right w:type="dxa" w:w="100"/>
+            </w:tcMar>
+          </w:tcPr>
+          <w:p>
+            <w:pPr>
+              <w:spacing w:line="276" w:lineRule="exactly" w:before="0" w:after="0"/>
+            </w:pPr>
+            <w:r>
+              <w:rPr>
+                <w:sz w:val="28"/>
+                <w:szCs w:val="28"/>
+                <w:rFonts w:ascii="Times New Roman" w:cs="Times New Roman" w:eastAsia="Times New Roman" w:hAnsi="Times New Roman"/>
+              </w:rPr>
             </w:r>
           </w:p>
         </w:tc>
@@ -1183,8 +1267,7 @@
       <w:tr>
         <w:tc>
           <w:tcPr>
-            <w:tcW w:type="dxa" w:w="9356"/>
-            <w:gridSpan w:val="2"/>
+            <w:tcW w:type="dxa" w:w="4678"/>
             <w:tcBorders>
               <w:top w:val="none" w:color="auto" w:sz="0"/>
               <w:left w:val="single" w:color="000000" w:sz="6"/>
@@ -1192,7 +1275,7 @@
               <w:right w:val="single" w:color="000000" w:sz="6"/>
             </w:tcBorders>
             <w:tcMar>
-              <w:top w:type="dxa" w:w="100"/>
+              <w:top w:type="dxa" w:w="80"/>
               <w:left w:type="dxa" w:w="100"/>
               <w:bottom w:type="dxa" w:w="60"/>
               <w:right w:type="dxa" w:w="100"/>
@@ -1211,6 +1294,35 @@
                 <w:rFonts w:ascii="Times New Roman" w:cs="Times New Roman" w:eastAsia="Times New Roman" w:hAnsi="Times New Roman"/>
               </w:rPr>
               <w:t xml:space="preserve">4. Vận dụng, trải nghiệm: 5 phút</w:t>
+            </w:r>
+          </w:p>
+        </w:tc>
+        <w:tc>
+          <w:tcPr>
+            <w:tcW w:type="dxa" w:w="4678"/>
+            <w:tcBorders>
+              <w:top w:val="none" w:color="auto" w:sz="0"/>
+              <w:left w:val="single" w:color="000000" w:sz="6"/>
+              <w:bottom w:val="none" w:color="auto" w:sz="0"/>
+              <w:right w:val="single" w:color="000000" w:sz="6"/>
+            </w:tcBorders>
+            <w:tcMar>
+              <w:top w:type="dxa" w:w="80"/>
+              <w:left w:type="dxa" w:w="100"/>
+              <w:bottom w:type="dxa" w:w="60"/>
+              <w:right w:type="dxa" w:w="100"/>
+            </w:tcMar>
+          </w:tcPr>
+          <w:p>
+            <w:pPr>
+              <w:spacing w:line="276" w:lineRule="exactly" w:before="0" w:after="0"/>
+            </w:pPr>
+            <w:r>
+              <w:rPr>
+                <w:sz w:val="28"/>
+                <w:szCs w:val="28"/>
+                <w:rFonts w:ascii="Times New Roman" w:cs="Times New Roman" w:eastAsia="Times New Roman" w:hAnsi="Times New Roman"/>
+              </w:rPr>
             </w:r>
           </w:p>
         </w:tc>

</xml_diff>